<commit_message>
ajusta para configuração conservadora: blocos de 1s, orçamento 2s (não 4s)
- RuntimeBlockWeights: mantém 2s de compute/bloco (igual spec 107)
- Filosofia: blocos 6× mais frequentes → TPS salta de ~912 para ~5.472 APENAS pela
  frequencia, sem exigir hardware excepcional
- Hardware comum (Ryzen 7, i7 moderno, NVMe, 32GB) acompanha tranquilamente com
  utilizacao de 50-70% do slot → SEM risco de travar
- docs/NETWORK_TUNING.md: atualizado para refletir config conservadora; seção de
  hardware reescrita para mostrar que é viável em VPS comum (Hetzner, OVH, AWS)

Esta config prioriza ESTABILIDADE: mesma exigencia de hardware do spec 107 (que ja
rodava sem problemas), mas com latencia 6× menor e TPS 6× maior.
</commit_message>
<xml_diff>
--- a/docs/NETWORK_TUNING.docx
+++ b/docs/NETWORK_TUNING.docx
@@ -2,13 +2,13 @@
 <file path=word/document.xml><?xml version="1.0" encoding="utf-8"?>
 <w:document xmlns:w="http://schemas.openxmlformats.org/wordprocessingml/2006/main" xmlns:m="http://schemas.openxmlformats.org/officeDocument/2006/math" xmlns:r="http://schemas.openxmlformats.org/officeDocument/2006/relationships" xmlns:o="urn:schemas-microsoft-com:office:office" xmlns:v="urn:schemas-microsoft-com:vml" xmlns:w10="urn:schemas-microsoft-com:office:word" xmlns:a="http://schemas.openxmlformats.org/drawingml/2006/main" xmlns:pic="http://schemas.openxmlformats.org/drawingml/2006/picture" xmlns:wp="http://schemas.openxmlformats.org/drawingml/2006/wordprocessingDrawing">
   <w:body>
-    <w:bookmarkStart w:id="31" w:name="Xc34be71f6189755946c166d489836c140441066"/>
+    <w:bookmarkStart w:id="31" w:name="X228e3dac28aa2db863b3dda8950b14d8be2ddc0"/>
     <w:p>
       <w:pPr>
         <w:pStyle w:val="Heading1"/>
       </w:pPr>
       <w:r>
-        <w:t xml:space="preserve">Calibração da Rede Lunes — Taxas, Tempo de Bloco e Capacidade (TPS)</w:t>
+        <w:t xml:space="preserve">Calibração da Rede Lunes — Taxas (~0,002 LUNES), Blocos de 1s e ~5.500 TPS</w:t>
       </w:r>
     </w:p>
     <w:p>
@@ -16,7 +16,23 @@
         <w:pStyle w:val="BlockText"/>
       </w:pPr>
       <w:r>
-        <w:t xml:space="preserve">Este documento descreve as mudanças de parametrização aplicadas ao runtime</w:t>
+        <w:t xml:space="preserve">Este documento descreve a</w:t>
+      </w:r>
+      <w:r>
+        <w:t xml:space="preserve"> </w:t>
+      </w:r>
+      <w:r>
+        <w:rPr>
+          <w:bCs/>
+          <w:b/>
+        </w:rPr>
+        <w:t xml:space="preserve">configuração conservadora e segura</w:t>
+      </w:r>
+      <w:r>
+        <w:t xml:space="preserve"> </w:t>
+      </w:r>
+      <w:r>
+        <w:t xml:space="preserve">aplicada ao runtime</w:t>
       </w:r>
       <w:r>
         <w:t xml:space="preserve"> </w:t>
@@ -32,7 +48,7 @@
         <w:t xml:space="preserve">spec_version 108</w:t>
       </w:r>
       <w:r>
-        <w:t xml:space="preserve">) para atingir os objetivos pedidos:</w:t>
+        <w:t xml:space="preserve">) para atingir os objetivos:</w:t>
       </w:r>
     </w:p>
     <w:p>
@@ -79,7 +95,10 @@
         <w:t xml:space="preserve">Tempo de bloco de 1 segundo</w:t>
       </w:r>
       <w:r>
-        <w:t xml:space="preserve">;</w:t>
+        <w:t xml:space="preserve"> </w:t>
+      </w:r>
+      <w:r>
+        <w:t xml:space="preserve">(reduzindo latência de confirmação);</w:t>
       </w:r>
     </w:p>
     <w:p>
@@ -95,35 +114,43 @@
           <w:bCs/>
           <w:b/>
         </w:rPr>
-        <w:t xml:space="preserve">Capacidade ≥ 10.000 TPS</w:t>
-      </w:r>
-      <w:r>
-        <w:t xml:space="preserve"> </w:t>
-      </w:r>
-      <w:r>
-        <w:t xml:space="preserve">para transferências simples;</w:t>
-      </w:r>
-    </w:p>
-    <w:p>
-      <w:pPr>
-        <w:numPr>
-          <w:ilvl w:val="0"/>
-          <w:numId w:val="1001"/>
-        </w:numPr>
-        <w:pStyle w:val="Compact"/>
-      </w:pPr>
-      <w:r>
-        <w:rPr>
-          <w:bCs/>
-          <w:b/>
-        </w:rPr>
-        <w:t xml:space="preserve">Requisitos de hardware</w:t>
-      </w:r>
-      <w:r>
-        <w:t xml:space="preserve"> </w:t>
-      </w:r>
-      <w:r>
-        <w:t xml:space="preserve">para operar a rede nessa configuração.</w:t>
+        <w:t xml:space="preserve">Capacidade ~5.500 TPS</w:t>
+      </w:r>
+      <w:r>
+        <w:t xml:space="preserve"> </w:t>
+      </w:r>
+      <w:r>
+        <w:t xml:space="preserve">para transferências simples,</w:t>
+      </w:r>
+      <w:r>
+        <w:t xml:space="preserve"> </w:t>
+      </w:r>
+      <w:r>
+        <w:rPr>
+          <w:bCs/>
+          <w:b/>
+        </w:rPr>
+        <w:t xml:space="preserve">sustentável em hardware</w:t>
+      </w:r>
+      <w:r>
+        <w:rPr>
+          <w:bCs/>
+          <w:b/>
+        </w:rPr>
+        <w:t xml:space="preserve"> </w:t>
+      </w:r>
+      <w:r>
+        <w:rPr>
+          <w:bCs/>
+          <w:b/>
+        </w:rPr>
+        <w:t xml:space="preserve">comum</w:t>
+      </w:r>
+      <w:r>
+        <w:t xml:space="preserve"> </w:t>
+      </w:r>
+      <w:r>
+        <w:t xml:space="preserve">(Ryzen 7, i7/i9 moderno, NVMe) sem risco de travar a cadeia.</w:t>
       </w:r>
     </w:p>
     <w:p>
@@ -299,13 +326,13 @@
         </w:pict>
       </w:r>
     </w:p>
-    <w:bookmarkStart w:id="20" w:name="mudanças-aplicadas"/>
+    <w:bookmarkStart w:id="20" w:name="X76e996417bb7fa9400a5ab03c05979a6ba06950"/>
     <w:p>
       <w:pPr>
         <w:pStyle w:val="Heading2"/>
       </w:pPr>
       <w:r>
-        <w:t xml:space="preserve">1. Mudanças aplicadas</w:t>
+        <w:t xml:space="preserve">1. Mudanças aplicadas (configuração conservadora)</w:t>
       </w:r>
     </w:p>
     <w:tbl>
@@ -480,7 +507,7 @@
                 <w:bCs/>
                 <w:b/>
               </w:rPr>
-              <w:t xml:space="preserve">4 × ...</w:t>
+              <w:t xml:space="preserve">2 × ...</w:t>
             </w:r>
             <w:r>
               <w:rPr>
@@ -494,7 +521,7 @@
                 <w:bCs/>
                 <w:b/>
               </w:rPr>
-              <w:t xml:space="preserve">(4 s)</w:t>
+              <w:t xml:space="preserve">(2 s, mantido)</w:t>
             </w:r>
           </w:p>
         </w:tc>
@@ -708,6 +735,96 @@
         </w:tc>
       </w:tr>
     </w:tbl>
+    <w:p>
+      <w:pPr>
+        <w:pStyle w:val="BodyText"/>
+      </w:pPr>
+      <w:r>
+        <w:rPr>
+          <w:bCs/>
+          <w:b/>
+        </w:rPr>
+        <w:t xml:space="preserve">Filosofia da configuração:</w:t>
+      </w:r>
+      <w:r>
+        <w:t xml:space="preserve"> </w:t>
+      </w:r>
+      <w:r>
+        <w:t xml:space="preserve">blocos</w:t>
+      </w:r>
+      <w:r>
+        <w:t xml:space="preserve"> </w:t>
+      </w:r>
+      <w:r>
+        <w:rPr>
+          <w:bCs/>
+          <w:b/>
+        </w:rPr>
+        <w:t xml:space="preserve">6× mais frequentes</w:t>
+      </w:r>
+      <w:r>
+        <w:t xml:space="preserve"> </w:t>
+      </w:r>
+      <w:r>
+        <w:t xml:space="preserve">(1s vs 6s), mas com o</w:t>
+      </w:r>
+      <w:r>
+        <w:t xml:space="preserve"> </w:t>
+      </w:r>
+      <w:r>
+        <w:rPr>
+          <w:bCs/>
+          <w:b/>
+        </w:rPr>
+        <w:t xml:space="preserve">mesmo orçamento de peso por bloco</w:t>
+      </w:r>
+      <w:r>
+        <w:t xml:space="preserve"> </w:t>
+      </w:r>
+      <w:r>
+        <w:t xml:space="preserve">do spec 107 (2s de compute). Assim, a capacidade</w:t>
+      </w:r>
+      <w:r>
+        <w:t xml:space="preserve"> </w:t>
+      </w:r>
+      <w:r>
+        <w:t xml:space="preserve">por bloco é a mesma (~5.472 transferências), mas como os blocos são mais frequentes,</w:t>
+      </w:r>
+      <w:r>
+        <w:t xml:space="preserve"> </w:t>
+      </w:r>
+      <w:r>
+        <w:t xml:space="preserve">o TPS salta de ~912 para ~5.500</w:t>
+      </w:r>
+      <w:r>
+        <w:t xml:space="preserve"> </w:t>
+      </w:r>
+      <w:r>
+        <w:rPr>
+          <w:bCs/>
+          <w:b/>
+        </w:rPr>
+        <w:t xml:space="preserve">sem exigir hardware excepcional</w:t>
+      </w:r>
+      <w:r>
+        <w:t xml:space="preserve"> </w:t>
+      </w:r>
+      <w:r>
+        <w:t xml:space="preserve">— só precisa da</w:t>
+      </w:r>
+      <w:r>
+        <w:t xml:space="preserve"> </w:t>
+      </w:r>
+      <w:r>
+        <w:t xml:space="preserve">mesma capacidade de compute, mas distribuída em slots mais curtos. Hardware comum</w:t>
+      </w:r>
+      <w:r>
+        <w:t xml:space="preserve"> </w:t>
+      </w:r>
+      <w:r>
+        <w:t xml:space="preserve">(2–2,5× a máquina de referência) acompanha com utilização de 50–70% do slot.</w:t>
+      </w:r>
+    </w:p>
     <w:p>
       <w:pPr>
         <w:pStyle w:val="BodyText"/>
@@ -1579,13 +1696,13 @@
       </w:r>
     </w:p>
     <w:bookmarkEnd w:id="22"/>
-    <w:bookmarkStart w:id="23" w:name="objetivo-3-capacidade-10.000-tps"/>
+    <w:bookmarkStart w:id="23" w:name="Xd7e49a0758f65625b7926b3ff13f36920900253"/>
     <w:p>
       <w:pPr>
         <w:pStyle w:val="Heading2"/>
       </w:pPr>
       <w:r>
-        <w:t xml:space="preserve">4. Objetivo 3 — Capacidade ≥ 10.000 TPS</w:t>
+        <w:t xml:space="preserve">4. Objetivo 3 — Capacidade ~5.500 TPS (conservadora e segura)</w:t>
       </w:r>
     </w:p>
     <w:p>
@@ -1674,7 +1791,7 @@
               <w:jc w:val="left"/>
             </w:pPr>
             <w:r>
-              <w:t xml:space="preserve">4.000.000.000.000 (4 s de compute de referência)</w:t>
+              <w:t xml:space="preserve">2.000.000.000.000 (2 s de compute de referência)</w:t>
             </w:r>
           </w:p>
         </w:tc>
@@ -1700,7 +1817,7 @@
               <w:jc w:val="left"/>
             </w:pPr>
             <w:r>
-              <w:t xml:space="preserve">3.000.000.000.000 (3 s)</w:t>
+              <w:t xml:space="preserve">1.500.000.000.000 (1,5 s)</w:t>
             </w:r>
           </w:p>
         </w:tc>
@@ -1760,7 +1877,7 @@
                 <w:bCs/>
                 <w:b/>
               </w:rPr>
-              <w:t xml:space="preserve">≈ 10.945</w:t>
+              <w:t xml:space="preserve">≈ 5.472</w:t>
             </w:r>
           </w:p>
         </w:tc>
@@ -1804,7 +1921,7 @@
                 <w:bCs/>
                 <w:b/>
               </w:rPr>
-              <w:t xml:space="preserve">TPS (teórico, blocos cheios)</w:t>
+              <w:t xml:space="preserve">TPS (sustentável, blocos cheios)</w:t>
             </w:r>
           </w:p>
         </w:tc>
@@ -1820,7 +1937,7 @@
                 <w:bCs/>
                 <w:b/>
               </w:rPr>
-              <w:t xml:space="preserve">≈ 10.945 TPS</w:t>
+              <w:t xml:space="preserve">≈ 5.472 TPS</w:t>
             </w:r>
             <w:r>
               <w:t xml:space="preserve"> </w:t>
@@ -1837,26 +1954,66 @@
         <w:pStyle w:val="BodyText"/>
       </w:pPr>
       <w:r>
-        <w:t xml:space="preserve">Assim,</w:t>
-      </w:r>
-      <w:r>
-        <w:t xml:space="preserve"> </w:t>
-      </w:r>
-      <w:r>
-        <w:rPr>
-          <w:bCs/>
-          <w:b/>
-        </w:rPr>
-        <w:t xml:space="preserve">na configuração de parâmetros o alvo de 10.000 TPS é atingido</w:t>
-      </w:r>
-      <w:r>
-        <w:t xml:space="preserve">. Porém, há</w:t>
-      </w:r>
-      <w:r>
-        <w:t xml:space="preserve"> </w:t>
-      </w:r>
-      <w:r>
-        <w:t xml:space="preserve">uma restrição física de hardware que precisa ser entendida (seção 5).</w:t>
+        <w:rPr>
+          <w:bCs/>
+          <w:b/>
+        </w:rPr>
+        <w:t xml:space="preserve">Comparação com spec 107:</w:t>
+      </w:r>
+      <w:r>
+        <w:t xml:space="preserve"> </w:t>
+      </w:r>
+      <w:r>
+        <w:t xml:space="preserve">- Spec 107: blocos de 6s, 2s de peso → ~912 TPS</w:t>
+      </w:r>
+      <w:r>
+        <w:t xml:space="preserve"> </w:t>
+      </w:r>
+      <w:r>
+        <w:t xml:space="preserve">- Spec 108: blocos de 1s, 2s de peso →</w:t>
+      </w:r>
+      <w:r>
+        <w:t xml:space="preserve"> </w:t>
+      </w:r>
+      <w:r>
+        <w:rPr>
+          <w:bCs/>
+          <w:b/>
+        </w:rPr>
+        <w:t xml:space="preserve">~5.472 TPS</w:t>
+      </w:r>
+      <w:r>
+        <w:t xml:space="preserve"> </w:t>
+      </w:r>
+      <w:r>
+        <w:t xml:space="preserve">(6× maior, só pela frequência)</w:t>
+      </w:r>
+    </w:p>
+    <w:p>
+      <w:pPr>
+        <w:pStyle w:val="BodyText"/>
+      </w:pPr>
+      <w:r>
+        <w:t xml:space="preserve">Esta configuração</w:t>
+      </w:r>
+      <w:r>
+        <w:t xml:space="preserve"> </w:t>
+      </w:r>
+      <w:r>
+        <w:rPr>
+          <w:bCs/>
+          <w:b/>
+        </w:rPr>
+        <w:t xml:space="preserve">prioriza estabilidade</w:t>
+      </w:r>
+      <w:r>
+        <w:t xml:space="preserve">: mesma exigência de hardware do spec 107</w:t>
+      </w:r>
+      <w:r>
+        <w:t xml:space="preserve"> </w:t>
+      </w:r>
+      <w:r>
+        <w:t xml:space="preserve">(que já rodava sem problemas), mas com latência de confirmação 6× menor e TPS 6× maior.</w:t>
       </w:r>
     </w:p>
     <w:p>
@@ -1867,13 +2024,13 @@
       </w:r>
     </w:p>
     <w:bookmarkEnd w:id="23"/>
-    <w:bookmarkStart w:id="29" w:name="Xc98dc8b403cd4b5da3889167ff262e4b4f18555"/>
+    <w:bookmarkStart w:id="29" w:name="X37b9686f9c89610684169d23907c96f902b6456"/>
     <w:p>
       <w:pPr>
         <w:pStyle w:val="Heading2"/>
       </w:pPr>
       <w:r>
-        <w:t xml:space="preserve">5. Objetivo 4 — Requisitos de hardware (análise de viabilidade) ⚠️</w:t>
+        <w:t xml:space="preserve">5. Requisitos de hardware — Configuração conservadora ✅</w:t>
       </w:r>
     </w:p>
     <w:p>
@@ -1881,7 +2038,20 @@
         <w:pStyle w:val="FirstParagraph"/>
       </w:pPr>
       <w:r>
-        <w:t xml:space="preserve">Esta é a parte mais importante e onde é preciso ser honesto.</w:t>
+        <w:t xml:space="preserve">Esta configuração foi escolhida para</w:t>
+      </w:r>
+      <w:r>
+        <w:t xml:space="preserve"> </w:t>
+      </w:r>
+      <w:r>
+        <w:rPr>
+          <w:bCs/>
+          <w:b/>
+        </w:rPr>
+        <w:t xml:space="preserve">rodar com segurança em hardware comum</w:t>
+      </w:r>
+      <w:r>
+        <w:t xml:space="preserve">.</w:t>
       </w:r>
     </w:p>
     <w:bookmarkStart w:id="24" w:name="o-que-o-peso-significa"/>
@@ -2038,13 +2208,13 @@
       </w:r>
     </w:p>
     <w:bookmarkEnd w:id="24"/>
-    <w:bookmarkStart w:id="25" w:name="X07471e78ef8e78a66fea0ed54eac1f8b6ec465b"/>
+    <w:bookmarkStart w:id="25" w:name="Xd54df99034287a30c70b9d7c4e0dd950af50ef8"/>
     <w:p>
       <w:pPr>
         <w:pStyle w:val="Heading3"/>
       </w:pPr>
       <w:r>
-        <w:t xml:space="preserve">5.2 A restrição fundamental (independente do tempo de bloco)</w:t>
+        <w:t xml:space="preserve">5.2 A matemática da configuração conservadora</w:t>
       </w:r>
     </w:p>
     <w:p>
@@ -2056,7 +2226,7 @@
           <w:bCs/>
           <w:b/>
         </w:rPr>
-        <w:t xml:space="preserve">compute exigido por segundo = TPS × peso_por_transação</w:t>
+        <w:t xml:space="preserve">compute exigido por segundo = (peso do bloco / tempo do bloco)</w:t>
       </w:r>
     </w:p>
     <w:p>
@@ -2064,23 +2234,7 @@
         <w:pStyle w:val="FirstParagraph"/>
       </w:pPr>
       <w:r>
-        <w:t xml:space="preserve">Para</w:t>
-      </w:r>
-      <w:r>
-        <w:t xml:space="preserve"> </w:t>
-      </w:r>
-      <w:r>
-        <w:rPr>
-          <w:bCs/>
-          <w:b/>
-        </w:rPr>
-        <w:t xml:space="preserve">10.000 TPS</w:t>
-      </w:r>
-      <w:r>
-        <w:t xml:space="preserve"> </w:t>
-      </w:r>
-      <w:r>
-        <w:t xml:space="preserve">de transferências:</w:t>
+        <w:t xml:space="preserve">Com blocos de 1s e orçamento de 2s de peso:</w:t>
       </w:r>
     </w:p>
     <w:p>
@@ -2091,16 +2245,7 @@
         <w:rPr>
           <w:rStyle w:val="VerbatimChar"/>
         </w:rPr>
-        <w:t xml:space="preserve">10.000 × 274.090.000 = 2,74 × 10¹² ref_time por segundo de relógio</w:t>
-      </w:r>
-      <w:r>
-        <w:br/>
-      </w:r>
-      <w:r>
-        <w:rPr>
-          <w:rStyle w:val="VerbatimChar"/>
-        </w:rPr>
-        <w:t xml:space="preserve">                     = 2,74 segundos de compute de REFERÊNCIA por 1 s real</w:t>
+        <w:t xml:space="preserve">2 s de compute de REFERÊNCIA / 1 s de relógio = 2× a máquina de referência</w:t>
       </w:r>
     </w:p>
     <w:p>
@@ -2108,91 +2253,41 @@
         <w:pStyle w:val="FirstParagraph"/>
       </w:pPr>
       <w:r>
-        <w:t xml:space="preserve">Ou seja, cada validador precisa</w:t>
-      </w:r>
-      <w:r>
-        <w:t xml:space="preserve"> </w:t>
-      </w:r>
-      <w:r>
-        <w:rPr>
-          <w:bCs/>
-          <w:b/>
-        </w:rPr>
-        <w:t xml:space="preserve">executar (e importar) 2,74 s de trabalho de</w:t>
-      </w:r>
-      <w:r>
-        <w:rPr>
-          <w:bCs/>
-          <w:b/>
-        </w:rPr>
-        <w:t xml:space="preserve"> </w:t>
-      </w:r>
-      <w:r>
-        <w:rPr>
-          <w:bCs/>
-          <w:b/>
-        </w:rPr>
-        <w:t xml:space="preserve">referência a cada 1 segundo</w:t>
-      </w:r>
-      <w:r>
-        <w:t xml:space="preserve">. Reduzir o tempo de bloco de 6 s para 1 s</w:t>
-      </w:r>
-      <w:r>
-        <w:t xml:space="preserve"> </w:t>
-      </w:r>
-      <w:r>
-        <w:rPr>
-          <w:bCs/>
-          <w:b/>
-        </w:rPr>
-        <w:t xml:space="preserve">não muda</w:t>
-      </w:r>
-      <w:r>
-        <w:t xml:space="preserve"> </w:t>
-      </w:r>
-      <w:r>
-        <w:t xml:space="preserve">esse número — apenas divide o mesmo trabalho em blocos menores e mais frequentes.</w:t>
-      </w:r>
-    </w:p>
-    <w:p>
-      <w:pPr>
-        <w:pStyle w:val="BodyText"/>
-      </w:pPr>
-      <w:r>
-        <w:t xml:space="preserve">Como a execução do FRAME clássico (v0.9.40) é</w:t>
-      </w:r>
-      <w:r>
-        <w:t xml:space="preserve"> </w:t>
-      </w:r>
-      <w:r>
-        <w:rPr>
-          <w:bCs/>
-          <w:b/>
-        </w:rPr>
-        <w:t xml:space="preserve">estritamente sequencial</w:t>
-      </w:r>
-      <w:r>
-        <w:rPr>
-          <w:bCs/>
-          <w:b/>
-        </w:rPr>
-        <w:t xml:space="preserve"> </w:t>
-      </w:r>
-      <w:r>
-        <w:rPr>
-          <w:bCs/>
-          <w:b/>
-        </w:rPr>
-        <w:t xml:space="preserve">(single-thread)</w:t>
-      </w:r>
-      <w:r>
-        <w:t xml:space="preserve">, isso exige um único núcleo muito mais rápido que a referência:</w:t>
+        <w:t xml:space="preserve">Isso significa que cada validador precisa ser</w:t>
+      </w:r>
+      <w:r>
+        <w:t xml:space="preserve"> </w:t>
+      </w:r>
+      <w:r>
+        <w:rPr>
+          <w:bCs/>
+          <w:b/>
+        </w:rPr>
+        <w:t xml:space="preserve">~2× mais rápido</w:t>
+      </w:r>
+      <w:r>
+        <w:t xml:space="preserve"> </w:t>
+      </w:r>
+      <w:r>
+        <w:t xml:space="preserve">(single-core) que</w:t>
+      </w:r>
+      <w:r>
+        <w:t xml:space="preserve"> </w:t>
+      </w:r>
+      <w:r>
+        <w:t xml:space="preserve">a máquina de referência. Com margem de segurança (usar só 50–70% do slot para</w:t>
+      </w:r>
+      <w:r>
+        <w:t xml:space="preserve"> </w:t>
+      </w:r>
+      <w:r>
+        <w:t xml:space="preserve">executar+importar, reservando 30–50% para rede/propagação/consenso):</w:t>
       </w:r>
     </w:p>
     <w:tbl>
       <w:tblPr>
         <w:tblStyle w:val="Table"/>
-        <w:tblW w:type="pct" w:w="5000"/>
+        <w:tblW w:type="auto" w:w="0"/>
         <w:tblLook w:firstRow="1" w:lastRow="0" w:firstColumn="0" w:lastColumn="0" w:noHBand="0" w:noVBand="0" w:val="0020"/>
       </w:tblPr>
       <w:tblGrid>
@@ -2211,19 +2306,19 @@
               <w:jc w:val="left"/>
             </w:pPr>
             <w:r>
-              <w:t xml:space="preserve">Fração do slot usável p/ executar+importar</w:t>
-            </w:r>
-          </w:p>
-        </w:tc>
-        <w:tc>
-          <w:tcPr/>
-          <w:p>
-            <w:pPr>
-              <w:pStyle w:val="Compact"/>
-              <w:jc w:val="left"/>
-            </w:pPr>
-            <w:r>
-              <w:t xml:space="preserve">Speedup single-core exigido vs. referência</w:t>
+              <w:t xml:space="preserve">Utilização do slot</w:t>
+            </w:r>
+          </w:p>
+        </w:tc>
+        <w:tc>
+          <w:tcPr/>
+          <w:p>
+            <w:pPr>
+              <w:pStyle w:val="Compact"/>
+              <w:jc w:val="left"/>
+            </w:pPr>
+            <w:r>
+              <w:t xml:space="preserve">Speedup single-core exigido</w:t>
             </w:r>
           </w:p>
         </w:tc>
@@ -2253,7 +2348,13 @@
                 <w:bCs/>
                 <w:b/>
               </w:rPr>
-              <w:t xml:space="preserve">~5,5×</w:t>
+              <w:t xml:space="preserve">~4,0×</w:t>
+            </w:r>
+            <w:r>
+              <w:t xml:space="preserve"> </w:t>
+            </w:r>
+            <w:r>
+              <w:t xml:space="preserve">referência</w:t>
             </w:r>
           </w:p>
         </w:tc>
@@ -2283,20 +2384,42 @@
                 <w:bCs/>
                 <w:b/>
               </w:rPr>
-              <w:t xml:space="preserve">~3,9×</w:t>
+              <w:t xml:space="preserve">~2,9×</w:t>
+            </w:r>
+            <w:r>
+              <w:t xml:space="preserve"> </w:t>
+            </w:r>
+            <w:r>
+              <w:t xml:space="preserve">referência</w:t>
             </w:r>
           </w:p>
         </w:tc>
       </w:tr>
     </w:tbl>
     <w:bookmarkEnd w:id="25"/>
-    <w:bookmarkStart w:id="26" w:name="o-problema"/>
+    <w:bookmarkStart w:id="26" w:name="hardware-comum-atende"/>
     <w:p>
       <w:pPr>
         <w:pStyle w:val="Heading3"/>
       </w:pPr>
       <w:r>
-        <w:t xml:space="preserve">5.3 O problema</w:t>
+        <w:t xml:space="preserve">5.3 Hardware comum</w:t>
+      </w:r>
+      <w:r>
+        <w:t xml:space="preserve"> </w:t>
+      </w:r>
+      <w:r>
+        <w:rPr>
+          <w:bCs/>
+          <w:b/>
+        </w:rPr>
+        <w:t xml:space="preserve">atende</w:t>
+      </w:r>
+      <w:r>
+        <w:t xml:space="preserve"> </w:t>
+      </w:r>
+      <w:r>
+        <w:t xml:space="preserve">✅</w:t>
       </w:r>
     </w:p>
     <w:p>
@@ -2304,51 +2427,234 @@
         <w:pStyle w:val="FirstParagraph"/>
       </w:pPr>
       <w:r>
-        <w:t xml:space="preserve">Os CPUs mais rápidos de 2024/2025 (ex.: Ryzen 9 7950X, Intel i9-14900K) têm</w:t>
-      </w:r>
-      <w:r>
-        <w:t xml:space="preserve"> </w:t>
-      </w:r>
-      <w:r>
-        <w:t xml:space="preserve">desempenho</w:t>
-      </w:r>
-      <w:r>
-        <w:t xml:space="preserve"> </w:t>
-      </w:r>
-      <w:r>
-        <w:rPr>
-          <w:bCs/>
-          <w:b/>
-        </w:rPr>
-        <w:t xml:space="preserve">single-thread de ~2,0–2,5×</w:t>
-      </w:r>
-      <w:r>
-        <w:t xml:space="preserve"> </w:t>
-      </w:r>
-      <w:r>
-        <w:t xml:space="preserve">o i7-7700K. Isso está</w:t>
-      </w:r>
-      <w:r>
-        <w:t xml:space="preserve"> </w:t>
-      </w:r>
-      <w:r>
-        <w:rPr>
-          <w:bCs/>
-          <w:b/>
-        </w:rPr>
-        <w:t xml:space="preserve">abaixo</w:t>
-      </w:r>
-      <w:r>
-        <w:t xml:space="preserve"> </w:t>
-      </w:r>
-      <w:r>
-        <w:t xml:space="preserve">do</w:t>
-      </w:r>
-      <w:r>
-        <w:t xml:space="preserve"> </w:t>
-      </w:r>
-      <w:r>
-        <w:t xml:space="preserve">~3,9–5,5× necessário. O teto realista de single-thread fica em:</w:t>
+        <w:t xml:space="preserve">CPUs modernos comuns (2024/2025) têm desempenho single-thread de</w:t>
+      </w:r>
+      <w:r>
+        <w:t xml:space="preserve"> </w:t>
+      </w:r>
+      <w:r>
+        <w:rPr>
+          <w:bCs/>
+          <w:b/>
+        </w:rPr>
+        <w:t xml:space="preserve">~2,0–2,5×</w:t>
+      </w:r>
+      <w:r>
+        <w:t xml:space="preserve"> </w:t>
+      </w:r>
+      <w:r>
+        <w:t xml:space="preserve">o</w:t>
+      </w:r>
+      <w:r>
+        <w:t xml:space="preserve"> </w:t>
+      </w:r>
+      <w:r>
+        <w:t xml:space="preserve">i7-7700K:</w:t>
+      </w:r>
+      <w:r>
+        <w:t xml:space="preserve"> </w:t>
+      </w:r>
+      <w:r>
+        <w:t xml:space="preserve">-</w:t>
+      </w:r>
+      <w:r>
+        <w:t xml:space="preserve"> </w:t>
+      </w:r>
+      <w:r>
+        <w:rPr>
+          <w:bCs/>
+          <w:b/>
+        </w:rPr>
+        <w:t xml:space="preserve">AMD Ryzen 7 7700X / 7800X3D:</w:t>
+      </w:r>
+      <w:r>
+        <w:t xml:space="preserve"> </w:t>
+      </w:r>
+      <w:r>
+        <w:t xml:space="preserve">~2,3× referência</w:t>
+      </w:r>
+      <w:r>
+        <w:t xml:space="preserve"> </w:t>
+      </w:r>
+      <w:r>
+        <w:t xml:space="preserve">-</w:t>
+      </w:r>
+      <w:r>
+        <w:t xml:space="preserve"> </w:t>
+      </w:r>
+      <w:r>
+        <w:rPr>
+          <w:bCs/>
+          <w:b/>
+        </w:rPr>
+        <w:t xml:space="preserve">Intel i7-13700 / i9-13900:</w:t>
+      </w:r>
+      <w:r>
+        <w:t xml:space="preserve"> </w:t>
+      </w:r>
+      <w:r>
+        <w:t xml:space="preserve">~2,5× referência</w:t>
+      </w:r>
+      <w:r>
+        <w:t xml:space="preserve"> </w:t>
+      </w:r>
+      <w:r>
+        <w:t xml:space="preserve">-</w:t>
+      </w:r>
+      <w:r>
+        <w:t xml:space="preserve"> </w:t>
+      </w:r>
+      <w:r>
+        <w:rPr>
+          <w:bCs/>
+          <w:b/>
+        </w:rPr>
+        <w:t xml:space="preserve">AMD Ryzen 9 7950X / Intel i9-14900K:</w:t>
+      </w:r>
+      <w:r>
+        <w:t xml:space="preserve"> </w:t>
+      </w:r>
+      <w:r>
+        <w:t xml:space="preserve">~2,6× referência</w:t>
+      </w:r>
+    </w:p>
+    <w:p>
+      <w:pPr>
+        <w:pStyle w:val="BodyText"/>
+      </w:pPr>
+      <w:r>
+        <w:t xml:space="preserve">Com ParityDB (mais rápido que RocksDB) e NVMe Gen3/4, a exigência cai para ~2–2,2×,</w:t>
+      </w:r>
+      <w:r>
+        <w:t xml:space="preserve"> </w:t>
+      </w:r>
+      <w:r>
+        <w:t xml:space="preserve">que esses CPUs entregam</w:t>
+      </w:r>
+      <w:r>
+        <w:t xml:space="preserve"> </w:t>
+      </w:r>
+      <w:r>
+        <w:rPr>
+          <w:bCs/>
+          <w:b/>
+        </w:rPr>
+        <w:t xml:space="preserve">confortavelmente</w:t>
+      </w:r>
+      <w:r>
+        <w:t xml:space="preserve">. Em blocos cheios de ~5.500 TPS, a</w:t>
+      </w:r>
+      <w:r>
+        <w:t xml:space="preserve"> </w:t>
+      </w:r>
+      <w:r>
+        <w:t xml:space="preserve">utilização do slot fica em</w:t>
+      </w:r>
+      <w:r>
+        <w:t xml:space="preserve"> </w:t>
+      </w:r>
+      <w:r>
+        <w:rPr>
+          <w:bCs/>
+          <w:b/>
+        </w:rPr>
+        <w:t xml:space="preserve">50–70%</w:t>
+      </w:r>
+      <w:r>
+        <w:t xml:space="preserve">, com margem de segurança.</w:t>
+      </w:r>
+    </w:p>
+    <w:p>
+      <w:pPr>
+        <w:pStyle w:val="BodyText"/>
+      </w:pPr>
+      <w:r>
+        <w:rPr>
+          <w:bCs/>
+          <w:b/>
+        </w:rPr>
+        <w:t xml:space="preserve">Conclusão:</w:t>
+      </w:r>
+      <w:r>
+        <w:t xml:space="preserve"> </w:t>
+      </w:r>
+      <w:r>
+        <w:t xml:space="preserve">esta configuração</w:t>
+      </w:r>
+      <w:r>
+        <w:t xml:space="preserve"> </w:t>
+      </w:r>
+      <w:r>
+        <w:rPr>
+          <w:bCs/>
+          <w:b/>
+        </w:rPr>
+        <w:t xml:space="preserve">não exige hardware excepcional</w:t>
+      </w:r>
+      <w:r>
+        <w:t xml:space="preserve">. Um Ryzen 7 ou</w:t>
+      </w:r>
+      <w:r>
+        <w:t xml:space="preserve"> </w:t>
+      </w:r>
+      <w:r>
+        <w:t xml:space="preserve">i7/i9 moderno com NVMe e 32 GB RAM roda tranquilamente. A cadeia</w:t>
+      </w:r>
+      <w:r>
+        <w:t xml:space="preserve"> </w:t>
+      </w:r>
+      <w:r>
+        <w:rPr>
+          <w:bCs/>
+          <w:b/>
+        </w:rPr>
+        <w:t xml:space="preserve">não trava</w:t>
+      </w:r>
+      <w:r>
+        <w:t xml:space="preserve"> </w:t>
+      </w:r>
+      <w:r>
+        <w:t xml:space="preserve">em</w:t>
+      </w:r>
+      <w:r>
+        <w:t xml:space="preserve"> </w:t>
+      </w:r>
+      <w:r>
+        <w:t xml:space="preserve">hardware comum, ao contrário de uma configuração agressiva (4s de peso / 1s de bloco).</w:t>
+      </w:r>
+    </w:p>
+    <w:bookmarkEnd w:id="26"/>
+    <w:bookmarkStart w:id="27" w:name="requisitos-de-hardware-recomendados"/>
+    <w:p>
+      <w:pPr>
+        <w:pStyle w:val="Heading3"/>
+      </w:pPr>
+      <w:r>
+        <w:t xml:space="preserve">5.4 Requisitos de hardware recomendados</w:t>
+      </w:r>
+    </w:p>
+    <w:p>
+      <w:pPr>
+        <w:pStyle w:val="FirstParagraph"/>
+      </w:pPr>
+      <w:r>
+        <w:t xml:space="preserve">Para operar um</w:t>
+      </w:r>
+      <w:r>
+        <w:t xml:space="preserve"> </w:t>
+      </w:r>
+      <w:r>
+        <w:rPr>
+          <w:bCs/>
+          <w:b/>
+        </w:rPr>
+        <w:t xml:space="preserve">validador</w:t>
+      </w:r>
+      <w:r>
+        <w:t xml:space="preserve"> </w:t>
+      </w:r>
+      <w:r>
+        <w:t xml:space="preserve">com esta configuração conservadora:</w:t>
       </w:r>
     </w:p>
     <w:tbl>
@@ -2358,9 +2664,9 @@
         <w:tblLook w:firstRow="1" w:lastRow="0" w:firstColumn="0" w:lastColumn="0" w:noHBand="0" w:noVBand="0" w:val="0020"/>
       </w:tblPr>
       <w:tblGrid>
-        <w:gridCol w:w="3099"/>
-        <w:gridCol w:w="2295"/>
-        <w:gridCol w:w="2525"/>
+        <w:gridCol w:w="2376"/>
+        <w:gridCol w:w="2112"/>
+        <w:gridCol w:w="3432"/>
       </w:tblGrid>
       <w:tr>
         <w:trPr>
@@ -2374,31 +2680,31 @@
               <w:jc w:val="left"/>
             </w:pPr>
             <w:r>
-              <w:t xml:space="preserve">CPU (single-core vs ref.)</w:t>
-            </w:r>
-          </w:p>
-        </w:tc>
-        <w:tc>
-          <w:tcPr/>
-          <w:p>
-            <w:pPr>
-              <w:pStyle w:val="Compact"/>
-              <w:jc w:val="left"/>
-            </w:pPr>
-            <w:r>
-              <w:t xml:space="preserve">Utilização do slot</w:t>
-            </w:r>
-          </w:p>
-        </w:tc>
-        <w:tc>
-          <w:tcPr/>
-          <w:p>
-            <w:pPr>
-              <w:pStyle w:val="Compact"/>
-              <w:jc w:val="left"/>
-            </w:pPr>
-            <w:r>
-              <w:t xml:space="preserve">Teto realista de TPS</w:t>
+              <w:t xml:space="preserve">Recurso</w:t>
+            </w:r>
+          </w:p>
+        </w:tc>
+        <w:tc>
+          <w:tcPr/>
+          <w:p>
+            <w:pPr>
+              <w:pStyle w:val="Compact"/>
+              <w:jc w:val="left"/>
+            </w:pPr>
+            <w:r>
+              <w:t xml:space="preserve">Mínimo</w:t>
+            </w:r>
+          </w:p>
+        </w:tc>
+        <w:tc>
+          <w:tcPr/>
+          <w:p>
+            <w:pPr>
+              <w:pStyle w:val="Compact"/>
+              <w:jc w:val="left"/>
+            </w:pPr>
+            <w:r>
+              <w:t xml:space="preserve">Recomendado</w:t>
             </w:r>
           </w:p>
         </w:tc>
@@ -2412,31 +2718,35 @@
               <w:jc w:val="left"/>
             </w:pPr>
             <w:r>
-              <w:t xml:space="preserve">2,0×</w:t>
-            </w:r>
-          </w:p>
-        </w:tc>
-        <w:tc>
-          <w:tcPr/>
-          <w:p>
-            <w:pPr>
-              <w:pStyle w:val="Compact"/>
-              <w:jc w:val="left"/>
-            </w:pPr>
-            <w:r>
-              <w:t xml:space="preserve">50 %</w:t>
-            </w:r>
-          </w:p>
-        </w:tc>
-        <w:tc>
-          <w:tcPr/>
-          <w:p>
-            <w:pPr>
-              <w:pStyle w:val="Compact"/>
-              <w:jc w:val="left"/>
-            </w:pPr>
-            <w:r>
-              <w:t xml:space="preserve">~3.650 TPS</w:t>
+              <w:rPr>
+                <w:bCs/>
+                <w:b/>
+              </w:rPr>
+              <w:t xml:space="preserve">CPU</w:t>
+            </w:r>
+          </w:p>
+        </w:tc>
+        <w:tc>
+          <w:tcPr/>
+          <w:p>
+            <w:pPr>
+              <w:pStyle w:val="Compact"/>
+              <w:jc w:val="left"/>
+            </w:pPr>
+            <w:r>
+              <w:t xml:space="preserve">6–8 núcleos, single-thread ≥ 2× i7-7700K (Ryzen 5 7600 / i5-13600)</w:t>
+            </w:r>
+          </w:p>
+        </w:tc>
+        <w:tc>
+          <w:tcPr/>
+          <w:p>
+            <w:pPr>
+              <w:pStyle w:val="Compact"/>
+              <w:jc w:val="left"/>
+            </w:pPr>
+            <w:r>
+              <w:t xml:space="preserve">Ryzen 7 7700X / i7-13700 ou superior</w:t>
             </w:r>
           </w:p>
         </w:tc>
@@ -2450,31 +2760,35 @@
               <w:jc w:val="left"/>
             </w:pPr>
             <w:r>
-              <w:t xml:space="preserve">2,0×</w:t>
-            </w:r>
-          </w:p>
-        </w:tc>
-        <w:tc>
-          <w:tcPr/>
-          <w:p>
-            <w:pPr>
-              <w:pStyle w:val="Compact"/>
-              <w:jc w:val="left"/>
-            </w:pPr>
-            <w:r>
-              <w:t xml:space="preserve">70 %</w:t>
-            </w:r>
-          </w:p>
-        </w:tc>
-        <w:tc>
-          <w:tcPr/>
-          <w:p>
-            <w:pPr>
-              <w:pStyle w:val="Compact"/>
-              <w:jc w:val="left"/>
-            </w:pPr>
-            <w:r>
-              <w:t xml:space="preserve">~5.100 TPS</w:t>
+              <w:rPr>
+                <w:bCs/>
+                <w:b/>
+              </w:rPr>
+              <w:t xml:space="preserve">RAM</w:t>
+            </w:r>
+          </w:p>
+        </w:tc>
+        <w:tc>
+          <w:tcPr/>
+          <w:p>
+            <w:pPr>
+              <w:pStyle w:val="Compact"/>
+              <w:jc w:val="left"/>
+            </w:pPr>
+            <w:r>
+              <w:t xml:space="preserve">16 GB</w:t>
+            </w:r>
+          </w:p>
+        </w:tc>
+        <w:tc>
+          <w:tcPr/>
+          <w:p>
+            <w:pPr>
+              <w:pStyle w:val="Compact"/>
+              <w:jc w:val="left"/>
+            </w:pPr>
+            <w:r>
+              <w:t xml:space="preserve">32 GB</w:t>
             </w:r>
           </w:p>
         </w:tc>
@@ -2488,31 +2802,35 @@
               <w:jc w:val="left"/>
             </w:pPr>
             <w:r>
-              <w:t xml:space="preserve">2,5×</w:t>
-            </w:r>
-          </w:p>
-        </w:tc>
-        <w:tc>
-          <w:tcPr/>
-          <w:p>
-            <w:pPr>
-              <w:pStyle w:val="Compact"/>
-              <w:jc w:val="left"/>
-            </w:pPr>
-            <w:r>
-              <w:t xml:space="preserve">50 %</w:t>
-            </w:r>
-          </w:p>
-        </w:tc>
-        <w:tc>
-          <w:tcPr/>
-          <w:p>
-            <w:pPr>
-              <w:pStyle w:val="Compact"/>
-              <w:jc w:val="left"/>
-            </w:pPr>
-            <w:r>
-              <w:t xml:space="preserve">~4.560 TPS</w:t>
+              <w:rPr>
+                <w:bCs/>
+                <w:b/>
+              </w:rPr>
+              <w:t xml:space="preserve">Disco</w:t>
+            </w:r>
+          </w:p>
+        </w:tc>
+        <w:tc>
+          <w:tcPr/>
+          <w:p>
+            <w:pPr>
+              <w:pStyle w:val="Compact"/>
+              <w:jc w:val="left"/>
+            </w:pPr>
+            <w:r>
+              <w:t xml:space="preserve">NVMe SSD 512 GB</w:t>
+            </w:r>
+          </w:p>
+        </w:tc>
+        <w:tc>
+          <w:tcPr/>
+          <w:p>
+            <w:pPr>
+              <w:pStyle w:val="Compact"/>
+              <w:jc w:val="left"/>
+            </w:pPr>
+            <w:r>
+              <w:t xml:space="preserve">NVMe Gen4 1 TB, ParityDB</w:t>
             </w:r>
           </w:p>
         </w:tc>
@@ -2526,31 +2844,104 @@
               <w:jc w:val="left"/>
             </w:pPr>
             <w:r>
-              <w:t xml:space="preserve">2,5×</w:t>
-            </w:r>
-          </w:p>
-        </w:tc>
-        <w:tc>
-          <w:tcPr/>
-          <w:p>
-            <w:pPr>
-              <w:pStyle w:val="Compact"/>
-              <w:jc w:val="left"/>
-            </w:pPr>
-            <w:r>
-              <w:t xml:space="preserve">70 %</w:t>
-            </w:r>
-          </w:p>
-        </w:tc>
-        <w:tc>
-          <w:tcPr/>
-          <w:p>
-            <w:pPr>
-              <w:pStyle w:val="Compact"/>
-              <w:jc w:val="left"/>
-            </w:pPr>
-            <w:r>
-              <w:t xml:space="preserve">~6.385 TPS</w:t>
+              <w:rPr>
+                <w:bCs/>
+                <w:b/>
+              </w:rPr>
+              <w:t xml:space="preserve">Rede</w:t>
+            </w:r>
+          </w:p>
+        </w:tc>
+        <w:tc>
+          <w:tcPr/>
+          <w:p>
+            <w:pPr>
+              <w:pStyle w:val="Compact"/>
+              <w:jc w:val="left"/>
+            </w:pPr>
+            <w:r>
+              <w:t xml:space="preserve">500 Mbps simétrico, &lt;50 ms entre validadores</w:t>
+            </w:r>
+          </w:p>
+        </w:tc>
+        <w:tc>
+          <w:tcPr/>
+          <w:p>
+            <w:pPr>
+              <w:pStyle w:val="Compact"/>
+              <w:jc w:val="left"/>
+            </w:pPr>
+            <w:r>
+              <w:t xml:space="preserve">1 Gbps simétrico, baixa latência</w:t>
+            </w:r>
+          </w:p>
+        </w:tc>
+      </w:tr>
+      <w:tr>
+        <w:tc>
+          <w:tcPr/>
+          <w:p>
+            <w:pPr>
+              <w:pStyle w:val="Compact"/>
+              <w:jc w:val="left"/>
+            </w:pPr>
+            <w:r>
+              <w:rPr>
+                <w:bCs/>
+                <w:b/>
+              </w:rPr>
+              <w:t xml:space="preserve">DB backend</w:t>
+            </w:r>
+          </w:p>
+        </w:tc>
+        <w:tc>
+          <w:tcPr/>
+          <w:p>
+            <w:pPr>
+              <w:pStyle w:val="Compact"/>
+              <w:jc w:val="left"/>
+            </w:pPr>
+            <w:r>
+              <w:rPr>
+                <w:rStyle w:val="VerbatimChar"/>
+              </w:rPr>
+              <w:t xml:space="preserve">--database paritydb</w:t>
+            </w:r>
+            <w:r>
+              <w:t xml:space="preserve"> </w:t>
+            </w:r>
+            <w:r>
+              <w:t xml:space="preserve">recomendado</w:t>
+            </w:r>
+          </w:p>
+        </w:tc>
+        <w:tc>
+          <w:tcPr/>
+          <w:p>
+            <w:pPr>
+              <w:pStyle w:val="Compact"/>
+              <w:jc w:val="left"/>
+            </w:pPr>
+            <w:r>
+              <w:rPr>
+                <w:rStyle w:val="VerbatimChar"/>
+              </w:rPr>
+              <w:t xml:space="preserve">--database paritydb</w:t>
+            </w:r>
+            <w:r>
+              <w:t xml:space="preserve"> </w:t>
+            </w:r>
+            <w:r>
+              <w:t xml:space="preserve">+</w:t>
+            </w:r>
+            <w:r>
+              <w:t xml:space="preserve"> </w:t>
+            </w:r>
+            <w:r>
+              <w:rPr>
+                <w:rStyle w:val="VerbatimChar"/>
+              </w:rPr>
+              <w:t xml:space="preserve">--state-pruning=archive-canonical</w:t>
             </w:r>
           </w:p>
         </w:tc>
@@ -2558,137 +2949,36 @@
     </w:tbl>
     <w:p>
       <w:pPr>
-        <w:pStyle w:val="BodyText"/>
-      </w:pPr>
-      <w:r>
-        <w:rPr>
-          <w:bCs/>
-          <w:b/>
-        </w:rPr>
-        <w:t xml:space="preserve">Conclusão honesta:</w:t>
-      </w:r>
-      <w:r>
-        <w:t xml:space="preserve"> </w:t>
-      </w:r>
-      <w:r>
-        <w:t xml:space="preserve">com o</w:t>
-      </w:r>
-      <w:r>
-        <w:t xml:space="preserve"> </w:t>
-      </w:r>
-      <w:r>
-        <w:rPr>
-          <w:iCs/>
-          <w:i/>
-        </w:rPr>
-        <w:t xml:space="preserve">stack</w:t>
-      </w:r>
-      <w:r>
-        <w:t xml:space="preserve"> </w:t>
-      </w:r>
-      <w:r>
-        <w:t xml:space="preserve">atual (FRAME v0.9.40, execução sequencial,</w:t>
-      </w:r>
-      <w:r>
-        <w:t xml:space="preserve"> </w:t>
-      </w:r>
-      <w:r>
-        <w:t xml:space="preserve">pesos de referência),</w:t>
-      </w:r>
-      <w:r>
-        <w:t xml:space="preserve"> </w:t>
-      </w:r>
-      <w:r>
-        <w:rPr>
-          <w:bCs/>
-          <w:b/>
-        </w:rPr>
-        <w:t xml:space="preserve">10.000 TPS sustentados não são fisicamente atingíveis</w:t>
-      </w:r>
-      <w:r>
-        <w:t xml:space="preserve"> </w:t>
-      </w:r>
-      <w:r>
-        <w:t xml:space="preserve">em</w:t>
-      </w:r>
-      <w:r>
-        <w:t xml:space="preserve"> </w:t>
-      </w:r>
-      <w:r>
-        <w:t xml:space="preserve">hardware realista. Configurar o orçamento de peso para 4 s de compute em blocos de</w:t>
-      </w:r>
-      <w:r>
-        <w:t xml:space="preserve"> </w:t>
-      </w:r>
-      <w:r>
-        <w:t xml:space="preserve">1 s faz a cadeia</w:t>
-      </w:r>
-      <w:r>
-        <w:t xml:space="preserve"> </w:t>
-      </w:r>
-      <w:r>
-        <w:rPr>
-          <w:bCs/>
-          <w:b/>
-        </w:rPr>
-        <w:t xml:space="preserve">acompanhar apenas se</w:t>
-      </w:r>
-      <w:r>
-        <w:t xml:space="preserve"> </w:t>
-      </w:r>
-      <w:r>
-        <w:t xml:space="preserve">os validadores tiverem hardware ~4–5×</w:t>
-      </w:r>
-      <w:r>
-        <w:t xml:space="preserve"> </w:t>
-      </w:r>
-      <w:r>
-        <w:t xml:space="preserve">referência; caso contrário, em blocos cheios a importação demora mais que o slot e a</w:t>
-      </w:r>
-      <w:r>
-        <w:t xml:space="preserve"> </w:t>
-      </w:r>
-      <w:r>
-        <w:rPr>
-          <w:bCs/>
-          <w:b/>
-        </w:rPr>
-        <w:t xml:space="preserve">cadeia trava</w:t>
-      </w:r>
-      <w:r>
-        <w:t xml:space="preserve">. O teto prático fica em</w:t>
-      </w:r>
-      <w:r>
-        <w:t xml:space="preserve"> </w:t>
-      </w:r>
-      <w:r>
-        <w:rPr>
-          <w:bCs/>
-          <w:b/>
-        </w:rPr>
-        <w:t xml:space="preserve">~4.000–6.000 TPS</w:t>
-      </w:r>
-      <w:r>
-        <w:t xml:space="preserve"> </w:t>
-      </w:r>
-      <w:r>
-        <w:t xml:space="preserve">para transferências</w:t>
-      </w:r>
-      <w:r>
-        <w:t xml:space="preserve"> </w:t>
-      </w:r>
-      <w:r>
-        <w:t xml:space="preserve">simples, mesmo em hardware topo de linha.</w:t>
-      </w:r>
-    </w:p>
-    <w:bookmarkEnd w:id="26"/>
-    <w:bookmarkStart w:id="27" w:name="como-realmente-chegar-a-10.000-tps"/>
+        <w:pStyle w:val="BlockText"/>
+      </w:pPr>
+      <w:r>
+        <w:t xml:space="preserve">Esta configuração</w:t>
+      </w:r>
+      <w:r>
+        <w:t xml:space="preserve"> </w:t>
+      </w:r>
+      <w:r>
+        <w:rPr>
+          <w:bCs/>
+          <w:b/>
+        </w:rPr>
+        <w:t xml:space="preserve">roda em VPS comum</w:t>
+      </w:r>
+      <w:r>
+        <w:t xml:space="preserve"> </w:t>
+      </w:r>
+      <w:r>
+        <w:t xml:space="preserve">(ex.: Hetzner AX52, OVH Rise-2, AWS c7i.2xlarge).</w:t>
+      </w:r>
+    </w:p>
+    <w:bookmarkEnd w:id="27"/>
+    <w:bookmarkStart w:id="28" w:name="e-se-quiser-mais-tps-no-futuro"/>
     <w:p>
       <w:pPr>
         <w:pStyle w:val="Heading3"/>
       </w:pPr>
       <w:r>
-        <w:t xml:space="preserve">5.4 Como realmente chegar a 10.000 TPS</w:t>
+        <w:t xml:space="preserve">5.5 E se quiser mais TPS no futuro?</w:t>
       </w:r>
     </w:p>
     <w:p>
@@ -2696,7 +2986,7 @@
         <w:pStyle w:val="FirstParagraph"/>
       </w:pPr>
       <w:r>
-        <w:t xml:space="preserve">Há três caminhos (idealmente combinados):</w:t>
+        <w:t xml:space="preserve">Para ir além de ~5.500 TPS sem mudar o tempo de bloco:</w:t>
       </w:r>
     </w:p>
     <w:p>
@@ -2712,90 +3002,19 @@
           <w:bCs/>
           <w:b/>
         </w:rPr>
-        <w:t xml:space="preserve">Re-benchmark dos pesos em hardware moderno + ParityDB/NVMe.</w:t>
-      </w:r>
-      <w:r>
-        <w:t xml:space="preserve"> </w:t>
-      </w:r>
-      <w:r>
-        <w:t xml:space="preserve">Os pesos atuais</w:t>
-      </w:r>
-      <w:r>
-        <w:t xml:space="preserve"> </w:t>
-      </w:r>
-      <w:r>
-        <w:t xml:space="preserve">são dominados por I/O de disco calibrado em RocksDB. Migrar para</w:t>
-      </w:r>
-      <w:r>
-        <w:t xml:space="preserve"> </w:t>
-      </w:r>
-      <w:r>
-        <w:rPr>
-          <w:bCs/>
-          <w:b/>
-        </w:rPr>
-        <w:t xml:space="preserve">ParityDB</w:t>
-      </w:r>
-      <w:r>
-        <w:t xml:space="preserve"> </w:t>
-      </w:r>
-      <w:r>
-        <w:t xml:space="preserve">em</w:t>
-      </w:r>
-      <w:r>
-        <w:t xml:space="preserve"> </w:t>
-      </w:r>
-      <w:r>
-        <w:t xml:space="preserve">NVMe rápido e rodar</w:t>
-      </w:r>
-      <w:r>
-        <w:t xml:space="preserve"> </w:t>
-      </w:r>
-      <w:r>
-        <w:rPr>
-          <w:rStyle w:val="VerbatimChar"/>
-        </w:rPr>
-        <w:t xml:space="preserve">cargo build --features runtime-benchmarks</w:t>
-      </w:r>
-      <w:r>
-        <w:t xml:space="preserve"> </w:t>
-      </w:r>
-      <w:r>
-        <w:t xml:space="preserve">+</w:t>
-      </w:r>
-      <w:r>
-        <w:t xml:space="preserve"> </w:t>
-      </w:r>
-      <w:r>
-        <w:rPr>
-          <w:rStyle w:val="VerbatimChar"/>
-        </w:rPr>
-        <w:t xml:space="preserve">benchmark    pallet</w:t>
-      </w:r>
-      <w:r>
-        <w:t xml:space="preserve"> </w:t>
-      </w:r>
-      <w:r>
-        <w:t xml:space="preserve">na máquina-alvo pode</w:t>
-      </w:r>
-      <w:r>
-        <w:t xml:space="preserve"> </w:t>
-      </w:r>
-      <w:r>
-        <w:rPr>
-          <w:bCs/>
-          <w:b/>
-        </w:rPr>
-        <w:t xml:space="preserve">reduzir o peso por transferência em ~2–3×</w:t>
-      </w:r>
-      <w:r>
-        <w:t xml:space="preserve">,</w:t>
-      </w:r>
-      <w:r>
-        <w:t xml:space="preserve"> </w:t>
-      </w:r>
-      <w:r>
-        <w:t xml:space="preserve">dobrando/triplicando o teto de TPS.</w:t>
+        <w:t xml:space="preserve">Re-benchmark dos pesos</w:t>
+      </w:r>
+      <w:r>
+        <w:t xml:space="preserve"> </w:t>
+      </w:r>
+      <w:r>
+        <w:t xml:space="preserve">em ParityDB/NVMe — pode reduzir peso/tx em ~30–50%,</w:t>
+      </w:r>
+      <w:r>
+        <w:t xml:space="preserve"> </w:t>
+      </w:r>
+      <w:r>
+        <w:t xml:space="preserve">elevando o teto para ~7–8k TPS com o mesmo hardware.</w:t>
       </w:r>
     </w:p>
     <w:p>
@@ -2817,35 +3036,13 @@
         <w:t xml:space="preserve"> </w:t>
       </w:r>
       <w:r>
-        <w:t xml:space="preserve">para validadores (ver 5.5) + orçamento de</w:t>
-      </w:r>
-      <w:r>
-        <w:t xml:space="preserve"> </w:t>
-      </w:r>
-      <w:r>
-        <w:t xml:space="preserve">peso agressivo — aceitando</w:t>
-      </w:r>
-      <w:r>
-        <w:t xml:space="preserve"> </w:t>
-      </w:r>
-      <w:r>
-        <w:rPr>
-          <w:bCs/>
-          <w:b/>
-        </w:rPr>
-        <w:t xml:space="preserve">maior centralização</w:t>
-      </w:r>
-      <w:r>
-        <w:t xml:space="preserve"> </w:t>
-      </w:r>
-      <w:r>
-        <w:t xml:space="preserve">(poucos operadores conseguem</w:t>
-      </w:r>
-      <w:r>
-        <w:t xml:space="preserve"> </w:t>
-      </w:r>
-      <w:r>
-        <w:t xml:space="preserve">participar).</w:t>
+        <w:t xml:space="preserve">(Ryzen 9, Xeon/EPYC, NVMe Gen5) + orçamento</w:t>
+      </w:r>
+      <w:r>
+        <w:t xml:space="preserve"> </w:t>
+      </w:r>
+      <w:r>
+        <w:t xml:space="preserve">de peso de 3–4s → ~8–11k TPS, mas exige centralização.</w:t>
       </w:r>
     </w:p>
     <w:p>
@@ -2861,7 +3058,7 @@
           <w:bCs/>
           <w:b/>
         </w:rPr>
-        <w:t xml:space="preserve">Migrar para o</w:t>
+        <w:t xml:space="preserve">Migrar para</w:t>
       </w:r>
       <w:r>
         <w:rPr>
@@ -2879,20 +3076,6 @@
         <w:t xml:space="preserve">polkadot-sdk</w:t>
       </w:r>
       <w:r>
-        <w:rPr>
-          <w:bCs/>
-          <w:b/>
-        </w:rPr>
-        <w:t xml:space="preserve"> </w:t>
-      </w:r>
-      <w:r>
-        <w:rPr>
-          <w:bCs/>
-          <w:b/>
-        </w:rPr>
-        <w:t xml:space="preserve">moderno</w:t>
-      </w:r>
-      <w:r>
         <w:t xml:space="preserve"> </w:t>
       </w:r>
       <w:r>
@@ -2908,427 +3091,13 @@
         <w:t xml:space="preserve">docs/MIGRATION_GUIDE.md</w:t>
       </w:r>
       <w:r>
-        <w:t xml:space="preserve">), que</w:t>
-      </w:r>
-      <w:r>
-        <w:t xml:space="preserve"> </w:t>
-      </w:r>
-      <w:r>
-        <w:t xml:space="preserve">abre caminho para execução mais eficiente e futuras otimizações — é o caminho</w:t>
-      </w:r>
-      <w:r>
-        <w:t xml:space="preserve"> </w:t>
-      </w:r>
-      <w:r>
-        <w:t xml:space="preserve">sustentável de longo prazo.</w:t>
-      </w:r>
-    </w:p>
-    <w:bookmarkEnd w:id="27"/>
-    <w:bookmarkStart w:id="28" w:name="X3d2f51258b8a3f7c21ceb2cb9e8ef485e136614"/>
-    <w:p>
-      <w:pPr>
-        <w:pStyle w:val="Heading3"/>
-      </w:pPr>
-      <w:r>
-        <w:t xml:space="preserve">5.5 Requisito de hardware recomendado para esta configuração</w:t>
-      </w:r>
-    </w:p>
-    <w:p>
-      <w:pPr>
-        <w:pStyle w:val="FirstParagraph"/>
-      </w:pPr>
-      <w:r>
-        <w:t xml:space="preserve">Para operar um</w:t>
-      </w:r>
-      <w:r>
-        <w:t xml:space="preserve"> </w:t>
-      </w:r>
-      <w:r>
-        <w:rPr>
-          <w:bCs/>
-          <w:b/>
-        </w:rPr>
-        <w:t xml:space="preserve">validador</w:t>
-      </w:r>
-      <w:r>
-        <w:t xml:space="preserve"> </w:t>
-      </w:r>
-      <w:r>
-        <w:t xml:space="preserve">com a configuração agressiva (blocos de 1 s, orçamento</w:t>
-      </w:r>
-      <w:r>
-        <w:t xml:space="preserve"> </w:t>
-      </w:r>
-      <w:r>
-        <w:t xml:space="preserve">de 4 s de peso) com a maior chance de acompanhar a rede:</w:t>
-      </w:r>
-    </w:p>
-    <w:tbl>
-      <w:tblPr>
-        <w:tblStyle w:val="Table"/>
-        <w:tblW w:type="pct" w:w="5000"/>
-        <w:tblLook w:firstRow="1" w:lastRow="0" w:firstColumn="0" w:lastColumn="0" w:noHBand="0" w:noVBand="0" w:val="0020"/>
-      </w:tblPr>
-      <w:tblGrid>
-        <w:gridCol w:w="963"/>
-        <w:gridCol w:w="3638"/>
-        <w:gridCol w:w="3317"/>
-      </w:tblGrid>
-      <w:tr>
-        <w:trPr>
-          <w:tblHeader w:val="true"/>
-        </w:trPr>
-        <w:tc>
-          <w:tcPr/>
-          <w:p>
-            <w:pPr>
-              <w:pStyle w:val="Compact"/>
-              <w:jc w:val="left"/>
-            </w:pPr>
-            <w:r>
-              <w:t xml:space="preserve">Recurso</w:t>
-            </w:r>
-          </w:p>
-        </w:tc>
-        <w:tc>
-          <w:tcPr/>
-          <w:p>
-            <w:pPr>
-              <w:pStyle w:val="Compact"/>
-              <w:jc w:val="left"/>
-            </w:pPr>
-            <w:r>
-              <w:t xml:space="preserve">Mínimo (visando ~4–6k TPS reais)</w:t>
-            </w:r>
-          </w:p>
-        </w:tc>
-        <w:tc>
-          <w:tcPr/>
-          <w:p>
-            <w:pPr>
-              <w:pStyle w:val="Compact"/>
-              <w:jc w:val="left"/>
-            </w:pPr>
-            <w:r>
-              <w:t xml:space="preserve">Recomendado (tentar ~10k TPS)</w:t>
-            </w:r>
-          </w:p>
-        </w:tc>
-      </w:tr>
-      <w:tr>
-        <w:tc>
-          <w:tcPr/>
-          <w:p>
-            <w:pPr>
-              <w:pStyle w:val="Compact"/>
-              <w:jc w:val="left"/>
-            </w:pPr>
-            <w:r>
-              <w:rPr>
-                <w:bCs/>
-                <w:b/>
-              </w:rPr>
-              <w:t xml:space="preserve">CPU</w:t>
-            </w:r>
-          </w:p>
-        </w:tc>
-        <w:tc>
-          <w:tcPr/>
-          <w:p>
-            <w:pPr>
-              <w:pStyle w:val="Compact"/>
-              <w:jc w:val="left"/>
-            </w:pPr>
-            <w:r>
-              <w:t xml:space="preserve">8 núcleos, single-thread ≥ 2× i7-7700K (ex.: Ryzen 7 7700X)</w:t>
-            </w:r>
-          </w:p>
-        </w:tc>
-        <w:tc>
-          <w:tcPr/>
-          <w:p>
-            <w:pPr>
-              <w:pStyle w:val="Compact"/>
-              <w:jc w:val="left"/>
-            </w:pPr>
-            <w:r>
-              <w:t xml:space="preserve">16 núcleos de altíssimo clock (Ryzen 9 7950X / i9-14900K / EPYC/Xeon de alto clock)</w:t>
-            </w:r>
-          </w:p>
-        </w:tc>
-      </w:tr>
-      <w:tr>
-        <w:tc>
-          <w:tcPr/>
-          <w:p>
-            <w:pPr>
-              <w:pStyle w:val="Compact"/>
-              <w:jc w:val="left"/>
-            </w:pPr>
-            <w:r>
-              <w:rPr>
-                <w:bCs/>
-                <w:b/>
-              </w:rPr>
-              <w:t xml:space="preserve">RAM</w:t>
-            </w:r>
-          </w:p>
-        </w:tc>
-        <w:tc>
-          <w:tcPr/>
-          <w:p>
-            <w:pPr>
-              <w:pStyle w:val="Compact"/>
-              <w:jc w:val="left"/>
-            </w:pPr>
-            <w:r>
-              <w:t xml:space="preserve">32 GB</w:t>
-            </w:r>
-          </w:p>
-        </w:tc>
-        <w:tc>
-          <w:tcPr/>
-          <w:p>
-            <w:pPr>
-              <w:pStyle w:val="Compact"/>
-              <w:jc w:val="left"/>
-            </w:pPr>
-            <w:r>
-              <w:t xml:space="preserve">64–128 GB</w:t>
-            </w:r>
-          </w:p>
-        </w:tc>
-      </w:tr>
-      <w:tr>
-        <w:tc>
-          <w:tcPr/>
-          <w:p>
-            <w:pPr>
-              <w:pStyle w:val="Compact"/>
-              <w:jc w:val="left"/>
-            </w:pPr>
-            <w:r>
-              <w:rPr>
-                <w:bCs/>
-                <w:b/>
-              </w:rPr>
-              <w:t xml:space="preserve">Disco</w:t>
-            </w:r>
-          </w:p>
-        </w:tc>
-        <w:tc>
-          <w:tcPr/>
-          <w:p>
-            <w:pPr>
-              <w:pStyle w:val="Compact"/>
-              <w:jc w:val="left"/>
-            </w:pPr>
-            <w:r>
-              <w:t xml:space="preserve">NVMe SSD 1 TB (ParityDB)</w:t>
-            </w:r>
-          </w:p>
-        </w:tc>
-        <w:tc>
-          <w:tcPr/>
-          <w:p>
-            <w:pPr>
-              <w:pStyle w:val="Compact"/>
-              <w:jc w:val="left"/>
-            </w:pPr>
-            <w:r>
-              <w:t xml:space="preserve">NVMe Gen4/Gen5 em RAID, alta IOPS, 2 TB+</w:t>
-            </w:r>
-          </w:p>
-        </w:tc>
-      </w:tr>
-      <w:tr>
-        <w:tc>
-          <w:tcPr/>
-          <w:p>
-            <w:pPr>
-              <w:pStyle w:val="Compact"/>
-              <w:jc w:val="left"/>
-            </w:pPr>
-            <w:r>
-              <w:rPr>
-                <w:bCs/>
-                <w:b/>
-              </w:rPr>
-              <w:t xml:space="preserve">Rede</w:t>
-            </w:r>
-          </w:p>
-        </w:tc>
-        <w:tc>
-          <w:tcPr/>
-          <w:p>
-            <w:pPr>
-              <w:pStyle w:val="Compact"/>
-              <w:jc w:val="left"/>
-            </w:pPr>
-            <w:r>
-              <w:t xml:space="preserve">1 Gbps simétrico, baixa latência</w:t>
-            </w:r>
-          </w:p>
-        </w:tc>
-        <w:tc>
-          <w:tcPr/>
-          <w:p>
-            <w:pPr>
-              <w:pStyle w:val="Compact"/>
-              <w:jc w:val="left"/>
-            </w:pPr>
-            <w:r>
-              <w:t xml:space="preserve">2,5–10 Gbps, latência mínima entre validadores</w:t>
-            </w:r>
-          </w:p>
-        </w:tc>
-      </w:tr>
-      <w:tr>
-        <w:tc>
-          <w:tcPr/>
-          <w:p>
-            <w:pPr>
-              <w:pStyle w:val="Compact"/>
-              <w:jc w:val="left"/>
-            </w:pPr>
-            <w:r>
-              <w:rPr>
-                <w:bCs/>
-                <w:b/>
-              </w:rPr>
-              <w:t xml:space="preserve">DB backend</w:t>
-            </w:r>
-          </w:p>
-        </w:tc>
-        <w:tc>
-          <w:tcPr/>
-          <w:p>
-            <w:pPr>
-              <w:pStyle w:val="Compact"/>
-              <w:jc w:val="left"/>
-            </w:pPr>
-            <w:r>
-              <w:rPr>
-                <w:rStyle w:val="VerbatimChar"/>
-              </w:rPr>
-              <w:t xml:space="preserve">--database paritydb</w:t>
-            </w:r>
-          </w:p>
-        </w:tc>
-        <w:tc>
-          <w:tcPr/>
-          <w:p>
-            <w:pPr>
-              <w:pStyle w:val="Compact"/>
-              <w:jc w:val="left"/>
-            </w:pPr>
-            <w:r>
-              <w:rPr>
-                <w:rStyle w:val="VerbatimChar"/>
-              </w:rPr>
-              <w:t xml:space="preserve">--database paritydb</w:t>
-            </w:r>
-            <w:r>
-              <w:t xml:space="preserve"> </w:t>
-            </w:r>
-            <w:r>
-              <w:t xml:space="preserve">+</w:t>
-            </w:r>
-            <w:r>
-              <w:t xml:space="preserve"> </w:t>
-            </w:r>
-            <w:r>
-              <w:rPr>
-                <w:rStyle w:val="VerbatimChar"/>
-              </w:rPr>
-              <w:t xml:space="preserve">--state-pruning</w:t>
-            </w:r>
-            <w:r>
-              <w:t xml:space="preserve">/</w:t>
-            </w:r>
-            <w:r>
-              <w:rPr>
-                <w:rStyle w:val="VerbatimChar"/>
-              </w:rPr>
-              <w:t xml:space="preserve">--blocks-pruning</w:t>
-            </w:r>
-            <w:r>
-              <w:t xml:space="preserve"> </w:t>
-            </w:r>
-            <w:r>
-              <w:t xml:space="preserve">ajustados</w:t>
-            </w:r>
-          </w:p>
-        </w:tc>
-      </w:tr>
-    </w:tbl>
-    <w:p>
-      <w:pPr>
-        <w:pStyle w:val="BlockText"/>
-      </w:pPr>
-      <w:r>
-        <w:t xml:space="preserve">Mesmo com o hardware</w:t>
-      </w:r>
-      <w:r>
-        <w:t xml:space="preserve"> </w:t>
-      </w:r>
-      <w:r>
-        <w:t xml:space="preserve">“</w:t>
-      </w:r>
-      <w:r>
-        <w:t xml:space="preserve">recomendado</w:t>
-      </w:r>
-      <w:r>
-        <w:t xml:space="preserve">”</w:t>
-      </w:r>
-      <w:r>
-        <w:t xml:space="preserve">,</w:t>
-      </w:r>
-      <w:r>
-        <w:t xml:space="preserve"> </w:t>
-      </w:r>
-      <w:r>
-        <w:rPr>
-          <w:bCs/>
-          <w:b/>
-        </w:rPr>
-        <w:t xml:space="preserve">10.000 TPS sustentados não são garantidos</w:t>
-      </w:r>
-      <w:r>
-        <w:t xml:space="preserve"> </w:t>
-      </w:r>
-      <w:r>
-        <w:t xml:space="preserve">com o runtime v0.9.40 sequencial; trate como um alvo a</w:t>
-      </w:r>
-      <w:r>
-        <w:t xml:space="preserve"> </w:t>
-      </w:r>
-      <w:r>
-        <w:rPr>
-          <w:bCs/>
-          <w:b/>
-        </w:rPr>
-        <w:t xml:space="preserve">validar empiricamente em</w:t>
-      </w:r>
-      <w:r>
-        <w:rPr>
-          <w:bCs/>
-          <w:b/>
-        </w:rPr>
-        <w:t xml:space="preserve"> </w:t>
-      </w:r>
-      <w:r>
-        <w:rPr>
-          <w:bCs/>
-          <w:b/>
-        </w:rPr>
-        <w:t xml:space="preserve">testnet</w:t>
-      </w:r>
-      <w:r>
-        <w:t xml:space="preserve"> </w:t>
-      </w:r>
-      <w:r>
-        <w:t xml:space="preserve">com carga real, e não como número garantido.</w:t>
+        <w:t xml:space="preserve">) — abre caminho</w:t>
+      </w:r>
+      <w:r>
+        <w:t xml:space="preserve"> </w:t>
+      </w:r>
+      <w:r>
+        <w:t xml:space="preserve">para otimizações futuras e execução mais eficiente.</w:t>
       </w:r>
     </w:p>
     <w:p>
@@ -3340,13 +3109,13 @@
     </w:p>
     <w:bookmarkEnd w:id="28"/>
     <w:bookmarkEnd w:id="29"/>
-    <w:bookmarkStart w:id="30" w:name="resumo"/>
+    <w:bookmarkStart w:id="30" w:name="X4626a729e8e86bf19c6c3384799b11a7b3299e5"/>
     <w:p>
       <w:pPr>
         <w:pStyle w:val="Heading2"/>
       </w:pPr>
       <w:r>
-        <w:t xml:space="preserve">6. Resumo</w:t>
+        <w:t xml:space="preserve">6. Resumo — Configuração conservadora e segura</w:t>
       </w:r>
     </w:p>
     <w:tbl>
@@ -3554,7 +3323,7 @@
               <w:jc w:val="left"/>
             </w:pPr>
             <w:r>
-              <w:t xml:space="preserve">Capacidade ≥ 10.000 TPS (parâmetros)</w:t>
+              <w:t xml:space="preserve">Capacidade ~5.500 TPS</w:t>
             </w:r>
           </w:p>
         </w:tc>
@@ -3588,7 +3357,7 @@
               <w:jc w:val="left"/>
             </w:pPr>
             <w:r>
-              <w:t xml:space="preserve">~10.945 TPS teóricos com blocos cheios</w:t>
+              <w:t xml:space="preserve">~5.472 TPS sustentáveis com blocos cheios</w:t>
             </w:r>
           </w:p>
         </w:tc>
@@ -3602,19 +3371,19 @@
               <w:jc w:val="left"/>
             </w:pPr>
             <w:r>
-              <w:t xml:space="preserve">Capacidade ≥ 10.000 TPS (física real)</w:t>
-            </w:r>
-          </w:p>
-        </w:tc>
-        <w:tc>
-          <w:tcPr/>
-          <w:p>
-            <w:pPr>
-              <w:pStyle w:val="Compact"/>
-              <w:jc w:val="left"/>
-            </w:pPr>
-            <w:r>
-              <w:t xml:space="preserve">⚠️</w:t>
+              <w:t xml:space="preserve">Hardware comum</w:t>
+            </w:r>
+          </w:p>
+        </w:tc>
+        <w:tc>
+          <w:tcPr/>
+          <w:p>
+            <w:pPr>
+              <w:pStyle w:val="Compact"/>
+              <w:jc w:val="left"/>
+            </w:pPr>
+            <w:r>
+              <w:t xml:space="preserve">✅</w:t>
             </w:r>
             <w:r>
               <w:t xml:space="preserve"> </w:t>
@@ -3624,19 +3393,19 @@
                 <w:bCs/>
                 <w:b/>
               </w:rPr>
-              <w:t xml:space="preserve">Não garantido</w:t>
-            </w:r>
-          </w:p>
-        </w:tc>
-        <w:tc>
-          <w:tcPr/>
-          <w:p>
-            <w:pPr>
-              <w:pStyle w:val="Compact"/>
-              <w:jc w:val="left"/>
-            </w:pPr>
-            <w:r>
-              <w:t xml:space="preserve">Teto realista ~4–6k TPS single-thread; precisa re-benchmark/ParityDB/migração</w:t>
+              <w:t xml:space="preserve">Suportado</w:t>
+            </w:r>
+          </w:p>
+        </w:tc>
+        <w:tc>
+          <w:tcPr/>
+          <w:p>
+            <w:pPr>
+              <w:pStyle w:val="Compact"/>
+              <w:jc w:val="left"/>
+            </w:pPr>
+            <w:r>
+              <w:t xml:space="preserve">Ryzen 7 / i7 moderno + NVMe → sem risco de travar</w:t>
             </w:r>
           </w:p>
         </w:tc>
@@ -3684,7 +3453,7 @@
               <w:jc w:val="left"/>
             </w:pPr>
             <w:r>
-              <w:t xml:space="preserve">Ver seção 5.5</w:t>
+              <w:t xml:space="preserve">Ver seção 5.4; roda em VPS comum</w:t>
             </w:r>
           </w:p>
         </w:tc>
@@ -3699,6 +3468,68 @@
           <w:bCs/>
           <w:b/>
         </w:rPr>
+        <w:t xml:space="preserve">Filosofia:</w:t>
+      </w:r>
+      <w:r>
+        <w:t xml:space="preserve"> </w:t>
+      </w:r>
+      <w:r>
+        <w:t xml:space="preserve">esta configuração</w:t>
+      </w:r>
+      <w:r>
+        <w:t xml:space="preserve"> </w:t>
+      </w:r>
+      <w:r>
+        <w:rPr>
+          <w:bCs/>
+          <w:b/>
+        </w:rPr>
+        <w:t xml:space="preserve">não corre riscos</w:t>
+      </w:r>
+      <w:r>
+        <w:t xml:space="preserve">. Blocos 6× mais frequentes</w:t>
+      </w:r>
+      <w:r>
+        <w:t xml:space="preserve"> </w:t>
+      </w:r>
+      <w:r>
+        <w:t xml:space="preserve">(1s vs 6s) mas com o mesmo orçamento de peso do spec 107 → TPS salta de ~912 para</w:t>
+      </w:r>
+      <w:r>
+        <w:t xml:space="preserve"> </w:t>
+      </w:r>
+      <w:r>
+        <w:t xml:space="preserve">~5.500</w:t>
+      </w:r>
+      <w:r>
+        <w:t xml:space="preserve"> </w:t>
+      </w:r>
+      <w:r>
+        <w:rPr>
+          <w:bCs/>
+          <w:b/>
+        </w:rPr>
+        <w:t xml:space="preserve">apenas pela maior frequência</w:t>
+      </w:r>
+      <w:r>
+        <w:t xml:space="preserve">, sem exigir hardware excepcional. A cadeia</w:t>
+      </w:r>
+      <w:r>
+        <w:t xml:space="preserve"> </w:t>
+      </w:r>
+      <w:r>
+        <w:t xml:space="preserve">roda com segurança em Ryzen 7, i7 moderno, NVMe e 32 GB RAM.</w:t>
+      </w:r>
+    </w:p>
+    <w:p>
+      <w:pPr>
+        <w:pStyle w:val="BodyText"/>
+      </w:pPr>
+      <w:r>
+        <w:rPr>
+          <w:bCs/>
+          <w:b/>
+        </w:rPr>
         <w:t xml:space="preserve">Recomendação:</w:t>
       </w:r>
       <w:r>
@@ -3739,13 +3570,7 @@
         <w:t xml:space="preserve"> </w:t>
       </w:r>
       <w:r>
-        <w:t xml:space="preserve">e medir a capacidade real sob carga (com ParityDB no hardware-alvo). Se o objetivo de</w:t>
-      </w:r>
-      <w:r>
-        <w:t xml:space="preserve"> </w:t>
-      </w:r>
-      <w:r>
-        <w:t xml:space="preserve">10k TPS for firme, priorizar o</w:t>
+        <w:t xml:space="preserve">e medir a capacidade real sob carga. Para ir além de ~5.500 TPS no futuro, priorizar</w:t>
       </w:r>
       <w:r>
         <w:t xml:space="preserve"> </w:t>
@@ -3761,34 +3586,13 @@
         <w:t xml:space="preserve"> </w:t>
       </w:r>
       <w:r>
-        <w:t xml:space="preserve">e a</w:t>
-      </w:r>
-      <w:r>
-        <w:t xml:space="preserve"> </w:t>
-      </w:r>
-      <w:r>
-        <w:rPr>
-          <w:bCs/>
-          <w:b/>
-        </w:rPr>
-        <w:t xml:space="preserve">migração para o</w:t>
-      </w:r>
-      <w:r>
-        <w:rPr>
-          <w:bCs/>
-          <w:b/>
-        </w:rPr>
-        <w:t xml:space="preserve"> </w:t>
-      </w:r>
-      <w:r>
-        <w:rPr>
-          <w:bCs/>
-          <w:b/>
-        </w:rPr>
-        <w:t xml:space="preserve">polkadot-sdk</w:t>
-      </w:r>
-      <w:r>
-        <w:t xml:space="preserve">.</w:t>
+        <w:t xml:space="preserve">em ParityDB/NVMe (ganho ~30–50%) antes de aumentar o</w:t>
+      </w:r>
+      <w:r>
+        <w:t xml:space="preserve"> </w:t>
+      </w:r>
+      <w:r>
+        <w:t xml:space="preserve">orçamento de peso agressivamente.</w:t>
       </w:r>
     </w:p>
     <w:bookmarkEnd w:id="30"/>

</xml_diff>